<commit_message>
Revert "Merge branch 'main' of https://github.com/jackSmith277/dealer"
This reverts commit 03fa7e3372aee4db0953f0bf36601432ab4c1d53, reversing
changes made to 51cf630407daa4d499536774cbb0a83e14b14327.
</commit_message>
<xml_diff>
--- a/aiplugin/插件/新建 DOCX 文档.docx
+++ b/aiplugin/插件/新建 DOCX 文档.docx
@@ -51,7 +51,7 @@
     <w:p>
       <w:pPr>
         <w:rPr>
-          <w:rFonts w:hint="eastAsia" w:ascii="宋体" w:hAnsi="宋体" w:eastAsia="宋体" w:cs="宋体"/>
+          <w:rFonts w:hint="default"/>
           <w:lang w:val="en-US" w:eastAsia="zh-CN"/>
         </w:rPr>
       </w:pPr>
@@ -61,36 +61,6 @@
           <w:lang w:val="en-US" w:eastAsia="zh-CN"/>
         </w:rPr>
         <w:t>张可悦是武汉理工通信专业女生</w:t>
-      </w:r>
-      <w:r>
-        <w:rPr>
-          <w:rFonts w:hint="eastAsia" w:ascii="宋体" w:hAnsi="宋体" w:eastAsia="宋体" w:cs="宋体"/>
-          <w:lang w:val="en-US" w:eastAsia="zh-CN"/>
-        </w:rPr>
-        <w:t>·</w:t>
-      </w:r>
-    </w:p>
-    <w:p>
-      <w:pPr>
-        <w:rPr>
-          <w:rFonts w:hint="eastAsia" w:ascii="宋体" w:hAnsi="宋体" w:eastAsia="宋体" w:cs="宋体"/>
-          <w:lang w:val="en-US" w:eastAsia="zh-CN"/>
-        </w:rPr>
-      </w:pPr>
-    </w:p>
-    <w:p>
-      <w:pPr>
-        <w:rPr>
-          <w:rFonts w:hint="default" w:ascii="宋体" w:hAnsi="宋体" w:eastAsia="宋体" w:cs="宋体"/>
-          <w:lang w:val="en-US" w:eastAsia="zh-CN"/>
-        </w:rPr>
-      </w:pPr>
-      <w:r>
-        <w:rPr>
-          <w:rFonts w:hint="eastAsia" w:ascii="宋体" w:hAnsi="宋体" w:eastAsia="宋体" w:cs="宋体"/>
-          <w:lang w:val="en-US" w:eastAsia="zh-CN"/>
-        </w:rPr>
-        <w:t>AI智能销售助手使用说明书：本助手涵盖四大核心功能：默认“AI 对话”可直接输入指令查询车型参数或获取话术；"Excel 分析”支持上传文件自动生成销售数据可视化报告；“服务洞察”可上传录音或文本评估服务质量；“爬取分析”只需输入 URL 即可抓取评论并输出舆情评分。用户仅需点击顶部导航栏切换模式，按界面提示操作即可高效完成销售辅助与数据分析任务。</w:t>
       </w:r>
       <w:bookmarkStart w:id="0" w:name="_GoBack"/>
       <w:bookmarkEnd w:id="0"/>

</xml_diff>